<commit_message>
Expand claim card section of demo script
Co-Authored-By: Claude Opus 5.5 <noreply@anthropic.com>
Claude-Session: https://claude.ai/code/session_016xYDD1T71e1a64vDWji2b2
</commit_message>
<xml_diff>
--- a/docs/Naskah-Demo-INTEGRA.docx
+++ b/docs/Naskah-Demo-INTEGRA.docx
@@ -39,7 +39,7 @@
           <w:sz w:val="20"/>
           <w:szCs w:val="20"/>
         </w:rPr>
-        <w:t xml:space="preserve">Durasi ±2 menit  ·  Teks miring dalam kurung = arahan di layar</w:t>
+        <w:t xml:space="preserve">Durasi ±2,5 menit  ·  Teks miring dalam kurung = arahan di layar</w:t>
       </w:r>
     </w:p>
     <w:p>
@@ -173,7 +173,7 @@
         <w:pStyle w:val="Heading2"/>
       </w:pPr>
       <w:r>
-        <w:t xml:space="preserve">3. Kartu Klaim (±50 detik) ★</w:t>
+        <w:t xml:space="preserve">3. Kartu Klaim (±75 detik) ★</w:t>
       </w:r>
     </w:p>
     <w:p>
@@ -198,7 +198,7 @@
         <w:ind w:left="360"/>
       </w:pPr>
       <w:r>
-        <w:t xml:space="preserve">Di </w:t>
+        <w:t xml:space="preserve">Ini </w:t>
       </w:r>
       <w:r>
         <w:rPr>
@@ -210,7 +210,68 @@
         <w:t xml:space="preserve">Kartu Klaim</w:t>
       </w:r>
       <w:r>
-        <w:t xml:space="preserve"> ada ringkasan dari AI dan tiga uji:</w:t>
+        <w:t xml:space="preserve">. Di bagian atas ada ringkasan klaim, </w:t>
+      </w:r>
+      <w:r>
+        <w:rPr>
+          <w:b/>
+          <w:bCs/>
+          <w:i w:val="false"/>
+          <w:iCs w:val="false"/>
+        </w:rPr>
+        <w:t xml:space="preserve">potensi selisih tarif</w:t>
+      </w:r>
+      <w:r>
+        <w:t xml:space="preserve">, dan penjelasan singkat dari AI soal apa yang ditemukan dan langkah berikutnya.</w:t>
+      </w:r>
+    </w:p>
+    <w:p>
+      <w:pPr>
+        <w:pBdr>
+          <w:left w:val="single" w:color="0F766E" w:sz="12" w:space="10"/>
+        </w:pBdr>
+        <w:spacing w:after="120" w:line="300"/>
+        <w:ind w:left="360"/>
+      </w:pPr>
+      <w:r>
+        <w:t xml:space="preserve">AI membaca setiap dokumen rekam medis, dan </w:t>
+      </w:r>
+      <w:r>
+        <w:rPr>
+          <w:b/>
+          <w:bCs/>
+          <w:i w:val="false"/>
+          <w:iCs w:val="false"/>
+        </w:rPr>
+        <w:t xml:space="preserve">setiap temuan wajib ada kutipan persis dari dokumen aslinya</w:t>
+      </w:r>
+      <w:r>
+        <w:t xml:space="preserve">. Kalau kutipannya nggak ketemu, temuannya dibuang. Jadi AI nggak bisa ngarang.</w:t>
+      </w:r>
+    </w:p>
+    <w:p>
+      <w:pPr>
+        <w:spacing w:after="80" w:before="80"/>
+      </w:pPr>
+      <w:r>
+        <w:rPr>
+          <w:i/>
+          <w:iCs/>
+          <w:color w:val="6B7280"/>
+        </w:rPr>
+        <w:t xml:space="preserve">(Tunjuk panel tiga uji)</w:t>
+      </w:r>
+    </w:p>
+    <w:p>
+      <w:pPr>
+        <w:pBdr>
+          <w:left w:val="single" w:color="0F766E" w:sz="12" w:space="10"/>
+        </w:pBdr>
+        <w:spacing w:after="120" w:line="300"/>
+        <w:ind w:left="360"/>
+      </w:pPr>
+      <w:r>
+        <w:t xml:space="preserve">Setelah itu, aturan klinis menilai lewat tiga uji:</w:t>
       </w:r>
     </w:p>
     <w:p>
@@ -230,7 +291,7 @@
         <w:t xml:space="preserve">Uji Ada</w:t>
       </w:r>
       <w:r>
-        <w:t xml:space="preserve">: diagnosis yang nggak ada bukti klinisnya.</w:t>
+        <w:t xml:space="preserve">: ngecek diagnosis sekunder yang nggak ada bukti klinisnya. Kalau nggak didukung, kelihatan juga potensi selisih tarifnya.</w:t>
       </w:r>
     </w:p>
     <w:p>
@@ -250,7 +311,7 @@
         <w:t xml:space="preserve">Uji Konsisten</w:t>
       </w:r>
       <w:r>
-        <w:t xml:space="preserve">: catatan yang saling bertentangan.</w:t>
+        <w:t xml:space="preserve">: nyari catatan yang saling bertentangan, atau catatan yang jamnya di luar masa rawat.</w:t>
       </w:r>
     </w:p>
     <w:p>
@@ -270,7 +331,7 @@
         <w:t xml:space="preserve">Uji Bukan Salinan</w:t>
       </w:r>
       <w:r>
-        <w:t xml:space="preserve">: dokumen yang mirip banget sama klaim pasien lain.</w:t>
+        <w:t xml:space="preserve">: ngecek dokumen yang mirip banget sama klaim pasien lain. Kalimat yang sama langsung di-highlight.</w:t>
       </w:r>
     </w:p>
     <w:p>
@@ -295,19 +356,19 @@
         <w:ind w:left="360"/>
       </w:pPr>
       <w:r>
-        <w:t xml:space="preserve">Setiap temuan </w:t>
-      </w:r>
-      <w:r>
-        <w:rPr>
-          <w:b/>
-          <w:bCs/>
-          <w:i w:val="false"/>
-          <w:iCs w:val="false"/>
-        </w:rPr>
-        <w:t xml:space="preserve">selalu ada kutipan dari dokumen aslinya</w:t>
-      </w:r>
-      <w:r>
-        <w:t xml:space="preserve">, jadi bisa dicek langsung.</w:t>
+        <w:t xml:space="preserve">Kalau kutipannya diklik, dokumen aslinya langsung kebuka. Jadi verifikator bisa cek sendiri, </w:t>
+      </w:r>
+      <w:r>
+        <w:rPr>
+          <w:b/>
+          <w:bCs/>
+          <w:i w:val="false"/>
+          <w:iCs w:val="false"/>
+        </w:rPr>
+        <w:t xml:space="preserve">nggak perlu percaya buta sama AI</w:t>
+      </w:r>
+      <w:r>
+        <w:t xml:space="preserve">.</w:t>
       </w:r>
     </w:p>
     <w:p>
@@ -320,7 +381,7 @@
           <w:iCs/>
           <w:color w:val="6B7280"/>
         </w:rPr>
-        <w:t xml:space="preserve">(Scroll ke panel keputusan)</w:t>
+        <w:t xml:space="preserve">(Scroll ke panel keputusan, pilih salah satu, isi alasan)</w:t>
       </w:r>
     </w:p>
     <w:p>
@@ -332,7 +393,7 @@
         <w:ind w:left="360"/>
       </w:pPr>
       <w:r>
-        <w:t xml:space="preserve">Keputusannya tetap di tangan verifikator: </w:t>
+        <w:t xml:space="preserve">Terakhir, keputusannya tetap di tangan verifikator: </w:t>
       </w:r>
       <w:r>
         <w:rPr>
@@ -344,7 +405,7 @@
         <w:t xml:space="preserve">setujui, minta klarifikasi, atau eskalasi</w:t>
       </w:r>
       <w:r>
-        <w:t xml:space="preserve">, dan semuanya tercatat.</w:t>
+        <w:t xml:space="preserve">, plus alasan singkat. Keputusan ini tercatat sebagai jejak audit, dan status klaim di antrean langsung ikut berubah.</w:t>
       </w:r>
     </w:p>
     <w:p>
@@ -488,7 +549,7 @@
         <w:t xml:space="preserve">sebelum demo</w:t>
       </w:r>
       <w:r>
-        <w:t xml:space="preserve"> biar nggak nunggu.</w:t>
+        <w:t xml:space="preserve"> biar nggak nunggu. Pilih klaim yang punya tanda di ketiga uji.</w:t>
       </w:r>
     </w:p>
     <w:p>

</xml_diff>